<commit_message>
queries.docx update + new dump for neo4j DB
</commit_message>
<xml_diff>
--- a/Neo4j/Queries.docx
+++ b/Neo4j/Queries.docx
@@ -441,6 +441,10 @@
     <w:p>
       <w:pPr>
         <w:spacing w:line="257" w:lineRule="auto"/>
+        <w:rPr>
+          <w:rFonts w:ascii="Calibri" w:hAnsi="Calibri" w:eastAsia="Calibri" w:cs="Calibri"/>
+          <w:lang w:val="it"/>
+        </w:rPr>
       </w:pPr>
       <w:r>
         <w:rPr>
@@ -546,6 +550,74 @@
           <w:lang w:val="it"/>
         </w:rPr>
         <w:t xml:space="preserve"> autori</w:t>
+      </w:r>
+    </w:p>
+    <w:p>
+      <w:pPr>
+        <w:pStyle w:val="ListParagraph"/>
+        <w:numPr>
+          <w:ilvl w:val="0"/>
+          <w:numId w:val="1"/>
+        </w:numPr>
+        <w:rPr>
+          <w:rFonts w:ascii="Calibri" w:hAnsi="Calibri" w:eastAsia="Calibri" w:cs="Calibri"/>
+          <w:lang w:val="it"/>
+        </w:rPr>
+      </w:pPr>
+      <w:r>
+        <w:rPr>
+          <w:rFonts w:ascii="Calibri" w:hAnsi="Calibri" w:eastAsia="Calibri" w:cs="Calibri"/>
+          <w:lang w:val="it"/>
+        </w:rPr>
+        <w:t xml:space="preserve">Percentuale di </w:t>
+      </w:r>
+      <w:proofErr w:type="spellStart"/>
+      <w:r>
+        <w:rPr>
+          <w:rFonts w:ascii="Calibri" w:hAnsi="Calibri" w:eastAsia="Calibri" w:cs="Calibri"/>
+          <w:lang w:val="it"/>
+        </w:rPr>
+        <w:t>incollection</w:t>
+      </w:r>
+      <w:proofErr w:type="spellEnd"/>
+      <w:r>
+        <w:rPr>
+          <w:rFonts w:ascii="Calibri" w:hAnsi="Calibri" w:eastAsia="Calibri" w:cs="Calibri"/>
+          <w:lang w:val="it"/>
+        </w:rPr>
+        <w:t xml:space="preserve"> scritte da Bart </w:t>
+      </w:r>
+      <w:proofErr w:type="spellStart"/>
+      <w:r>
+        <w:rPr>
+          <w:rFonts w:ascii="Calibri" w:hAnsi="Calibri" w:eastAsia="Calibri" w:cs="Calibri"/>
+          <w:lang w:val="it"/>
+        </w:rPr>
+        <w:t>Preneel</w:t>
+      </w:r>
+      <w:proofErr w:type="spellEnd"/>
+      <w:r>
+        <w:rPr>
+          <w:rFonts w:ascii="Calibri" w:hAnsi="Calibri" w:eastAsia="Calibri" w:cs="Calibri"/>
+          <w:lang w:val="it"/>
+        </w:rPr>
+        <w:t xml:space="preserve"> dal 2000 al 2019 rispetto ai libri dal 2000 al 2019 (le </w:t>
+      </w:r>
+      <w:proofErr w:type="spellStart"/>
+      <w:r>
+        <w:rPr>
+          <w:rFonts w:ascii="Calibri" w:hAnsi="Calibri" w:eastAsia="Calibri" w:cs="Calibri"/>
+          <w:lang w:val="it"/>
+        </w:rPr>
+        <w:t>incollection</w:t>
+      </w:r>
+      <w:proofErr w:type="spellEnd"/>
+      <w:r>
+        <w:rPr>
+          <w:rFonts w:ascii="Calibri" w:hAnsi="Calibri" w:eastAsia="Calibri" w:cs="Calibri"/>
+          <w:lang w:val="it"/>
+        </w:rPr>
+        <w:t xml:space="preserve"> sono sezioni di libri)</w:t>
       </w:r>
     </w:p>
     <w:p>
@@ -1881,7 +1953,7 @@
           <v:shape id="_x0000_i1025" style="width:450.75pt;height:72.75pt" o:ole="" type="#_x0000_t75">
             <v:imagedata o:title="" r:id="rId8"/>
           </v:shape>
-          <o:OLEObject Type="Embed" ProgID="Word.Document.12" ShapeID="_x0000_i1025" DrawAspect="Content" ObjectID="_1728448153" r:id="rId9">
+          <o:OLEObject Type="Embed" ProgID="Word.Document.12" ShapeID="_x0000_i1025" DrawAspect="Content" ObjectID="_1728600170" r:id="rId9">
             <o:FieldCodes>\s</o:FieldCodes>
           </o:OLEObject>
         </w:object>
@@ -2501,32 +2573,165 @@
     </w:p>
     <w:p>
       <w:pPr>
-        <w:rPr>
-          <w:lang w:val="en-US"/>
-        </w:rPr>
-      </w:pPr>
-    </w:p>
-    <w:p>
-      <w:pPr>
-        <w:rPr>
-          <w:lang w:val="en-US"/>
-        </w:rPr>
-      </w:pPr>
-    </w:p>
-    <w:p>
-      <w:pPr>
-        <w:rPr>
-          <w:lang w:val="en-US"/>
-        </w:rPr>
-      </w:pPr>
-    </w:p>
-    <w:p>
-      <w:pPr>
-        <w:rPr>
-          <w:lang w:val="en-US"/>
-        </w:rPr>
-      </w:pPr>
-    </w:p>
+        <w:shd w:val="clear" w:color="auto" w:fill="1E1E1E"/>
+        <w:spacing w:after="0" w:line="240" w:lineRule="auto"/>
+        <w:rPr>
+          <w:rFonts w:ascii="Times New Roman" w:hAnsi="Times New Roman" w:eastAsia="Times New Roman" w:cs="Times New Roman"/>
+          <w:color w:val="93A1A1"/>
+          <w:sz w:val="24"/>
+          <w:szCs w:val="24"/>
+          <w:lang w:val="en-US" w:eastAsia="en-GB"/>
+        </w:rPr>
+      </w:pPr>
+      <w:r>
+        <w:rPr>
+          <w:rFonts w:ascii="Times New Roman" w:hAnsi="Times New Roman" w:eastAsia="Times New Roman" w:cs="Times New Roman"/>
+          <w:color w:val="FDF6E3"/>
+          <w:sz w:val="24"/>
+          <w:szCs w:val="24"/>
+          <w:lang w:val="en-US" w:eastAsia="en-GB"/>
+        </w:rPr>
+        <w:t xml:space="preserve">Percentuale di incollection scritte da Bart Preneel dal </w:t>
+      </w:r>
+      <w:r>
+        <w:rPr>
+          <w:rFonts w:ascii="Times New Roman" w:hAnsi="Times New Roman" w:eastAsia="Times New Roman" w:cs="Times New Roman"/>
+          <w:color w:val="2AA198"/>
+          <w:sz w:val="24"/>
+          <w:szCs w:val="24"/>
+          <w:lang w:val="en-US" w:eastAsia="en-GB"/>
+        </w:rPr>
+        <w:t>2000</w:t>
+      </w:r>
+      <w:r>
+        <w:rPr>
+          <w:rFonts w:ascii="Times New Roman" w:hAnsi="Times New Roman" w:eastAsia="Times New Roman" w:cs="Times New Roman"/>
+          <w:color w:val="FDF6E3"/>
+          <w:sz w:val="24"/>
+          <w:szCs w:val="24"/>
+          <w:lang w:val="en-US" w:eastAsia="en-GB"/>
+        </w:rPr>
+        <w:t xml:space="preserve"> al </w:t>
+      </w:r>
+      <w:r>
+        <w:rPr>
+          <w:rFonts w:ascii="Times New Roman" w:hAnsi="Times New Roman" w:eastAsia="Times New Roman" w:cs="Times New Roman"/>
+          <w:color w:val="2AA198"/>
+          <w:sz w:val="24"/>
+          <w:szCs w:val="24"/>
+          <w:lang w:val="en-US" w:eastAsia="en-GB"/>
+        </w:rPr>
+        <w:t>2019</w:t>
+      </w:r>
+      <w:r>
+        <w:rPr>
+          <w:rFonts w:ascii="Times New Roman" w:hAnsi="Times New Roman" w:eastAsia="Times New Roman" w:cs="Times New Roman"/>
+          <w:color w:val="FDF6E3"/>
+          <w:sz w:val="24"/>
+          <w:szCs w:val="24"/>
+          <w:lang w:val="en-US" w:eastAsia="en-GB"/>
+        </w:rPr>
+        <w:t xml:space="preserve"> rispetto ai libri dal </w:t>
+      </w:r>
+      <w:r>
+        <w:rPr>
+          <w:rFonts w:ascii="Times New Roman" w:hAnsi="Times New Roman" w:eastAsia="Times New Roman" w:cs="Times New Roman"/>
+          <w:color w:val="2AA198"/>
+          <w:sz w:val="24"/>
+          <w:szCs w:val="24"/>
+          <w:lang w:val="en-US" w:eastAsia="en-GB"/>
+        </w:rPr>
+        <w:t>2000</w:t>
+      </w:r>
+      <w:r>
+        <w:rPr>
+          <w:rFonts w:ascii="Times New Roman" w:hAnsi="Times New Roman" w:eastAsia="Times New Roman" w:cs="Times New Roman"/>
+          <w:color w:val="FDF6E3"/>
+          <w:sz w:val="24"/>
+          <w:szCs w:val="24"/>
+          <w:lang w:val="en-US" w:eastAsia="en-GB"/>
+        </w:rPr>
+        <w:t xml:space="preserve"> al </w:t>
+      </w:r>
+      <w:r>
+        <w:rPr>
+          <w:rFonts w:ascii="Times New Roman" w:hAnsi="Times New Roman" w:eastAsia="Times New Roman" w:cs="Times New Roman"/>
+          <w:color w:val="2AA198"/>
+          <w:sz w:val="24"/>
+          <w:szCs w:val="24"/>
+          <w:lang w:val="en-US" w:eastAsia="en-GB"/>
+        </w:rPr>
+        <w:t>2019</w:t>
+      </w:r>
+      <w:r>
+        <w:rPr>
+          <w:rFonts w:ascii="Times New Roman" w:hAnsi="Times New Roman" w:eastAsia="Times New Roman" w:cs="Times New Roman"/>
+          <w:color w:val="FDF6E3"/>
+          <w:sz w:val="24"/>
+          <w:szCs w:val="24"/>
+          <w:lang w:val="en-US" w:eastAsia="en-GB"/>
+        </w:rPr>
+        <w:t xml:space="preserve"> </w:t>
+      </w:r>
+      <w:r>
+        <w:rPr>
+          <w:rFonts w:ascii="Times New Roman" w:hAnsi="Times New Roman" w:eastAsia="Times New Roman" w:cs="Times New Roman"/>
+          <w:color w:val="93A1A1"/>
+          <w:sz w:val="24"/>
+          <w:szCs w:val="24"/>
+          <w:lang w:val="en-US" w:eastAsia="en-GB"/>
+        </w:rPr>
+        <w:t>(</w:t>
+      </w:r>
+      <w:r>
+        <w:rPr>
+          <w:rFonts w:ascii="Times New Roman" w:hAnsi="Times New Roman" w:eastAsia="Times New Roman" w:cs="Times New Roman"/>
+          <w:color w:val="FDF6E3"/>
+          <w:sz w:val="24"/>
+          <w:szCs w:val="24"/>
+          <w:lang w:val="en-US" w:eastAsia="en-GB"/>
+        </w:rPr>
+        <w:t>le incollection sono sezioni di libri</w:t>
+      </w:r>
+      <w:r>
+        <w:rPr>
+          <w:rFonts w:ascii="Times New Roman" w:hAnsi="Times New Roman" w:eastAsia="Times New Roman" w:cs="Times New Roman"/>
+          <w:color w:val="93A1A1"/>
+          <w:sz w:val="24"/>
+          <w:szCs w:val="24"/>
+          <w:lang w:val="en-US" w:eastAsia="en-GB"/>
+        </w:rPr>
+        <w:t>)</w:t>
+      </w:r>
+    </w:p>
+    <w:p>
+      <w:pPr>
+        <w:ind w:left="360"/>
+        <w:rPr>
+          <w:lang w:val="en-US"/>
+        </w:rPr>
+      </w:pPr>
+    </w:p>
+    <w:bookmarkStart w:name="_MON_1728628931" w:id="1"/>
+    <w:bookmarkEnd w:id="1"/>
+    <w:p>
+      <w:r>
+        <w:rPr>
+          <w:noProof/>
+        </w:rPr>
+        <w:object w:dxaOrig="9020" w:dyaOrig="5500" w14:anchorId="0E696DC4">
+          <v:shape id="_x0000_i1026" style="width:450.75pt;height:275.25pt" o:ole="" type="#_x0000_t75">
+            <v:imagedata o:title="" r:id="rId10"/>
+          </v:shape>
+          <o:OLEObject Type="Embed" ProgID="Word.Document.12" ShapeID="_x0000_i1026" DrawAspect="Content" ObjectID="_1728600171" r:id="rId11">
+            <o:FieldCodes>\s</o:FieldCodes>
+          </o:OLEObject>
+        </w:object>
+      </w:r>
+    </w:p>
+    <w:p/>
+    <w:p/>
+    <w:p/>
     <w:p>
       <w:pPr>
         <w:rPr>

</xml_diff>